<commit_message>
Atualizando o MER com Legenda
</commit_message>
<xml_diff>
--- a/Projeto/banco de dados/Modelagem Relacional/MER TCC (com legenda).docx
+++ b/Projeto/banco de dados/Modelagem Relacional/MER TCC (com legenda).docx
@@ -344,10 +344,10 @@
           <w:noProof/>
         </w:rPr>
         <w:drawing>
-          <wp:inline distT="0" distB="0" distL="0" distR="0" wp14:anchorId="1647C453" wp14:editId="7005B057">
-            <wp:extent cx="5401945" cy="4568190"/>
-            <wp:effectExtent l="0" t="0" r="8255" b="3810"/>
-            <wp:docPr id="618127247" name="Imagem 2"/>
+          <wp:inline distT="0" distB="0" distL="0" distR="0" wp14:anchorId="77701CB4" wp14:editId="6FD53F28">
+            <wp:extent cx="5401945" cy="4043045"/>
+            <wp:effectExtent l="0" t="0" r="8255" b="0"/>
+            <wp:docPr id="1410120254" name="Imagem 2"/>
             <wp:cNvGraphicFramePr>
               <a:graphicFrameLocks xmlns:a="http://schemas.openxmlformats.org/drawingml/2006/main" noChangeAspect="1"/>
             </wp:cNvGraphicFramePr>
@@ -355,7 +355,7 @@
               <a:graphicData uri="http://schemas.openxmlformats.org/drawingml/2006/picture">
                 <pic:pic xmlns:pic="http://schemas.openxmlformats.org/drawingml/2006/picture">
                   <pic:nvPicPr>
-                    <pic:cNvPr id="618127247" name="Imagem 618127247"/>
+                    <pic:cNvPr id="1410120254" name="Imagem 1410120254"/>
                     <pic:cNvPicPr/>
                   </pic:nvPicPr>
                   <pic:blipFill>
@@ -373,7 +373,7 @@
                   <pic:spPr>
                     <a:xfrm>
                       <a:off x="0" y="0"/>
-                      <a:ext cx="5401945" cy="4568190"/>
+                      <a:ext cx="5401945" cy="4043045"/>
                     </a:xfrm>
                     <a:prstGeom prst="rect">
                       <a:avLst/>

</xml_diff>